<commit_message>
fix(contracts): guard notify() against null user_id on awaiting_manual signers
- includes/contracts.php: apply_signature() now matches
  apply_signature_by_token()'s existing guard, and rb_render_agreement_pdf()
  surfaces real mPDF errors instead of swallowing them to null (verified
  live on InfinityFree, root-caused a separate mpdf tempDir issue there).
- Rename chat.php -> message.php: the root inbox page was being blocked by
  InfinityFree's edge WAF (likely a filename signature match), independent
  of session/auth; renaming sidesteps it since it's outside our control.
- Add Docker + Render + Aiven MySQL deploy path (Dockerfile, docker/,
  render.yaml) as an alternative to shared hosting, with DB_PORT/DB_SSL_CA
  support in config/database.php for Aiven's TLS-required managed MySQL.

Co-Authored-By: Claude Sonnet 5 <noreply@anthropic.com>
Claude-Session: https://claude.ai/code/session_01EY1bgHFthb9evjhsbFvAQn
</commit_message>
<xml_diff>
--- a/docs/report/Chapter5_Draft.docx
+++ b/docs/report/Chapter5_Draft.docx
@@ -1117,21 +1117,163 @@
           <w:szCs w:val="26"/>
           <w:rFonts w:ascii="Times New Roman" w:cs="Times New Roman" w:eastAsia="Times New Roman" w:hAnsi="Times New Roman"/>
         </w:rPr>
-        <w:t xml:space="preserve">5.6  Summary</w:t>
-      </w:r>
-    </w:p>
-    <w:p>
-      <w:pPr>
-        <w:spacing w:after="140" w:line="300"/>
-        <w:jc w:val="both"/>
-      </w:pPr>
-      <w:r>
-        <w:rPr>
-          <w:sz w:val="24"/>
-          <w:szCs w:val="24"/>
-          <w:rFonts w:ascii="Times New Roman" w:cs="Times New Roman" w:eastAsia="Times New Roman" w:hAnsi="Times New Roman"/>
-        </w:rPr>
-        <w:t xml:space="preserve">This chapter described the implementation of RentBridge, from the development environment and layered architecture to the database and each core module — authentication, property listing with maps, semester-based tenancies and Find Housemate, agent verification, multi-party e-signed contracts, commission accounting, and messaging. The implemented system realises the design of Chapter 4 and is validated by the testing described in Chapter 6.</w:t>
+        <w:t xml:space="preserve">5.6  Deployment</w:t>
+      </w:r>
+    </w:p>
+    <w:p>
+      <w:pPr>
+        <w:spacing w:after="140" w:line="300"/>
+        <w:jc w:val="both"/>
+      </w:pPr>
+      <w:r>
+        <w:rPr>
+          <w:sz w:val="24"/>
+          <w:szCs w:val="24"/>
+          <w:rFonts w:ascii="Times New Roman" w:cs="Times New Roman" w:eastAsia="Times New Roman" w:hAnsi="Times New Roman"/>
+        </w:rPr>
+        <w:t xml:space="preserve">To validate the system beyond the local development environment, RentBridge was deployed to InfinityFree, a free shared-hosting provider offering PHP 8.1 and MariaDB, with Brevo used as the production transactional email relay in place of the Mailtrap sandbox used during development. Preparing for this deployment surfaced several issues that only appear once the system leaves a fully-trusted local environment, described below.</w:t>
+      </w:r>
+    </w:p>
+    <w:p>
+      <w:pPr>
+        <w:spacing w:after="140" w:line="300"/>
+        <w:jc w:val="both"/>
+      </w:pPr>
+      <w:r>
+        <w:rPr>
+          <w:sz w:val="24"/>
+          <w:szCs w:val="24"/>
+          <w:rFonts w:ascii="Times New Roman" w:cs="Times New Roman" w:eastAsia="Times New Roman" w:hAnsi="Times New Roman"/>
+        </w:rPr>
+        <w:t xml:space="preserve">A review of the deployment configuration found that includes/mail_config.php had live SMTP credentials committed directly to the project's public GitHub repository. This file was refactored to the same pattern already used for the Google Maps and OpenAI API keys: configuration values are read from environment variables first, with a git-ignored local file as an optional fallback for development, so no credential needs to be committed again. The database-connection error handler was also changed to log the underlying error server-side rather than display it in the browser, and a leftover debug flag that force-enabled PHP error display regardless of the production configuration was removed.</w:t>
+      </w:r>
+    </w:p>
+    <w:p>
+      <w:pPr>
+        <w:spacing w:after="140" w:line="300"/>
+        <w:jc w:val="both"/>
+      </w:pPr>
+      <w:r>
+        <w:rPr>
+          <w:sz w:val="24"/>
+          <w:szCs w:val="24"/>
+          <w:rFonts w:ascii="Times New Roman" w:cs="Times New Roman" w:eastAsia="Times New Roman" w:hAnsi="Times New Roman"/>
+        </w:rPr>
+        <w:t xml:space="preserve">Before deployment, all sixteen incremental SQL migration files were audited against the development database to confirm they had been correctly applied; one migration that had shipped in application code but was never executed against the database was identified and applied. Moving to free shared hosting then surfaced host-specific constraints not present in the local XAMPP environment:</w:t>
+      </w:r>
+    </w:p>
+    <w:p>
+      <w:pPr>
+        <w:pStyle w:val="ListParagraph"/>
+        <w:numPr>
+          <w:ilvl w:val="0"/>
+          <w:numId w:val="1"/>
+        </w:numPr>
+        <w:spacing w:after="60" w:line="288"/>
+      </w:pPr>
+      <w:r>
+        <w:rPr>
+          <w:sz w:val="24"/>
+          <w:szCs w:val="24"/>
+          <w:rFonts w:ascii="Times New Roman" w:cs="Times New Roman" w:eastAsia="Times New Roman" w:hAnsi="Times New Roman"/>
+        </w:rPr>
+        <w:t xml:space="preserve">The hosting provider's database user was not granted the TRIGGER privilege, which the audit-log triggers depend on. Trigger-based audit logging was left inactive on this host, since no part of the application reads from the audit log, only writes to it.</w:t>
+      </w:r>
+    </w:p>
+    <w:p>
+      <w:pPr>
+        <w:pStyle w:val="ListParagraph"/>
+        <w:numPr>
+          <w:ilvl w:val="0"/>
+          <w:numId w:val="1"/>
+        </w:numPr>
+        <w:spacing w:after="60" w:line="288"/>
+      </w:pPr>
+      <w:r>
+        <w:rPr>
+          <w:sz w:val="24"/>
+          <w:szCs w:val="24"/>
+          <w:rFonts w:ascii="Times New Roman" w:cs="Times New Roman" w:eastAsia="Times New Roman" w:hAnsi="Times New Roman"/>
+        </w:rPr>
+        <w:t xml:space="preserve">The database user was also not granted the CREATE PROCEDURE privilege, which the cascade-to-RESTRICT foreign-key migration depended on. That migration was rewritten to use session-variable and PREPARE/EXECUTE dynamic SQL instead of a stored procedure, achieving the same result without the restricted privilege.</w:t>
+      </w:r>
+    </w:p>
+    <w:p>
+      <w:pPr>
+        <w:pStyle w:val="ListParagraph"/>
+        <w:numPr>
+          <w:ilvl w:val="0"/>
+          <w:numId w:val="1"/>
+        </w:numPr>
+        <w:spacing w:after="60" w:line="288"/>
+      </w:pPr>
+      <w:r>
+        <w:rPr>
+          <w:sz w:val="24"/>
+          <w:szCs w:val="24"/>
+          <w:rFonts w:ascii="Times New Roman" w:cs="Times New Roman" w:eastAsia="Times New Roman" w:hAnsi="Times New Roman"/>
+        </w:rPr>
+        <w:t xml:space="preserve">A byte-order-mark character left at the start of three SQL dump files by a Windows-based export tool caused the hosting provider's phpMyAdmin import to fail with a syntax error; the byte-order marks were identified and removed.</w:t>
+      </w:r>
+    </w:p>
+    <w:p>
+      <w:pPr>
+        <w:spacing w:after="140" w:line="300"/>
+        <w:jc w:val="both"/>
+      </w:pPr>
+      <w:r>
+        <w:rPr>
+          <w:sz w:val="24"/>
+          <w:szCs w:val="24"/>
+          <w:rFonts w:ascii="Times New Roman" w:cs="Times New Roman" w:eastAsia="Times New Roman" w:hAnsi="Times New Roman"/>
+        </w:rPr>
+        <w:t xml:space="preserve">Before the production database was migrated, the full automated test suite was re-run to confirm no regression: all thirteen PHPUnit backend tests and all thirty-nine Playwright end-to-end tests passed, with one pre-existing test skipped for an environment-dependent condition unrelated to this work. This process also diagnosed and corrected a genuine gap in the end-to-end test for the multi-party contract-signing flow, where the test had not driven the landlord's signature and so never observed the tenancy reach its fully active state before checking that late co-tenant addition was correctly blocked.</w:t>
+      </w:r>
+    </w:p>
+    <w:p>
+      <w:pPr>
+        <w:spacing w:before="40" w:after="160"/>
+        <w:jc w:val="center"/>
+      </w:pPr>
+      <w:r>
+        <w:rPr>
+          <w:i/>
+          <w:iCs/>
+          <w:sz w:val="22"/>
+          <w:szCs w:val="22"/>
+          <w:rFonts w:ascii="Times New Roman" w:cs="Times New Roman" w:eastAsia="Times New Roman" w:hAnsi="Times New Roman"/>
+        </w:rPr>
+        <w:t xml:space="preserve">Figure 5.10: InfinityFree control panel showing the deployed application and imported production database  [insert screenshot]</w:t>
+      </w:r>
+    </w:p>
+    <w:p>
+      <w:pPr>
+        <w:pStyle w:val="Heading2"/>
+        <w:spacing w:before="200" w:after="120"/>
+      </w:pPr>
+      <w:r>
+        <w:rPr>
+          <w:b/>
+          <w:bCs/>
+          <w:sz w:val="26"/>
+          <w:szCs w:val="26"/>
+          <w:rFonts w:ascii="Times New Roman" w:cs="Times New Roman" w:eastAsia="Times New Roman" w:hAnsi="Times New Roman"/>
+        </w:rPr>
+        <w:t xml:space="preserve">5.7  Summary</w:t>
+      </w:r>
+    </w:p>
+    <w:p>
+      <w:pPr>
+        <w:spacing w:after="140" w:line="300"/>
+        <w:jc w:val="both"/>
+      </w:pPr>
+      <w:r>
+        <w:rPr>
+          <w:sz w:val="24"/>
+          <w:szCs w:val="24"/>
+          <w:rFonts w:ascii="Times New Roman" w:cs="Times New Roman" w:eastAsia="Times New Roman" w:hAnsi="Times New Roman"/>
+        </w:rPr>
+        <w:t xml:space="preserve">This chapter described the implementation of RentBridge, from the development environment and layered architecture to the database and each core module — authentication, property listing with maps, semester-based tenancies and Find Housemate, agent verification, multi-party e-signed contracts, commission accounting, and messaging — and its deployment to a production hosting environment. The implemented system realises the design of Chapter 4 and is validated by the testing described in Chapter 6.</w:t>
       </w:r>
     </w:p>
     <w:sectPr>

</xml_diff>